<commit_message>
The copy stops promising any ledger or every figure, and says the reason counts toward the rank
The 404 page, the drill's scope note, the release notes and the facilitator's guide described the
checker as settling every figure on any ledger; they now say it reads a ledger in an accepted layout,
checks what its grammar reads and holds the rest for review. Five strings in the drill, the
governance note and both facilitator guides said the reason score never moves the rank; its fifty
points go into the total the rank is read off, so the copy says so and the code is unchanged. The
guides count attempts rather than players and never report codenames as people, the stale fixture
and readout field counts are gone, and the facilitator guide PDF and the results readout docx are
rebuilt from their sources, the readout at its new three-page allowance.

Co-Authored-By: Claude Opus 5 <noreply@anthropic.com>
</commit_message>
<xml_diff>
--- a/Second-Pass-Facilitator-Guide.docx
+++ b/Second-Pass-Facilitator-Guide.docx
@@ -647,7 +647,7 @@
           <w:b w:val="0"/>
           <w:sz w:val="21"/>
         </w:rPr>
-        <w:t>The player calls the line, the buttons become a chip row, and no reveal comes until a chip is tapped. Say that in the framing. The chips: figure does not tie, direction wrong, no source on file, wrong period, wrong account, nothing written where owed, and on a stand, the figure and reason hold. Each card carries a key of the chips that fit it, so a reason scores right when one tapped chip is in the key and none is outside it. The end screen prints the call score beside the reason score, ranks read the call alone, and the reason score tests the stated basis for contradiction rather than proving anybody reasoned.</w:t>
+        <w:t>The player calls the line, the buttons become a chip row, and no reveal comes until a chip is tapped. Say that in the framing. The chips: figure does not tie, direction wrong, no source on file, wrong period, wrong account, nothing written where owed, and on a stand, the figure and reason hold. Each card carries a key of the chips that fit it, so a reason scores right when one tapped chip is in the key and none is outside it. The end screen prints the call score beside the reason score. The badges read the calls alone, an agreeing reason adds points toward the rank, and the reason score tests the stated basis for contradiction rather than proving anybody reasoned.</w:t>
       </w:r>
     </w:p>
     <w:p>
@@ -1261,7 +1261,7 @@
           <w:b w:val="0"/>
           <w:sz w:val="21"/>
         </w:rPr>
-        <w:t>Run findings.py against the downloaded responses and fill READOUT-TEMPLATE.md, or take four by hand: call accuracy on the eight problem lines, 1, 2, 3, 7, 8, 11, 12 and 14; false flags on the six clean lines; reason accuracy from Reason: agrees. in each Why cell; the fresh case from question C. Card one is inverted, so flagging 4200 posts Reject. Count codenames, not rows, and drop test rows.</w:t>
+        <w:t>Run findings.py against the downloaded responses and fill READOUT-TEMPLATE.md, or take four by hand: call accuracy on the eight problem lines, 1, 2, 3, 7, 8, 11, 12 and 14; false flags on the six clean lines; reason accuracy from Reason: agrees. in each Why cell; the fresh case from question C. Card one is inverted, so flagging 4200 posts Reject. Drop test rows, count attempts rather than rows, read only the first attempt under each codename, and never report codenames as people.</w:t>
       </w:r>
     </w:p>
     <w:sectPr>

</xml_diff>